<commit_message>
fixed everything now... yea
</commit_message>
<xml_diff>
--- a/docs/activities/index.docx
+++ b/docs/activities/index.docx
@@ -8,6 +8,14 @@
       </w:pPr>
       <w:r>
         <w:t xml:space="preserve">Activities</w:t>
+      </w:r>
+    </w:p>
+    <w:p>
+      <w:pPr>
+        <w:pStyle w:val="Author"/>
+      </w:pPr>
+      <w:r>
+        <w:t xml:space="preserve">Bill Perry</w:t>
       </w:r>
     </w:p>
     <w:p>

</xml_diff>